<commit_message>
abstrakt je v pohodě asi akorát na synopsy se pracuje
</commit_message>
<xml_diff>
--- a/ceske-hlavicky/Abstrakt-odborne-prace_formular.docx
+++ b/ceske-hlavicky/Abstrakt-odborne-prace_formular.docx
@@ -139,9 +139,14 @@
             <w:pPr>
               <w:jc w:val="both"/>
             </w:pPr>
+            <w:proofErr w:type="spellStart"/>
             <w:proofErr w:type="gramStart"/>
             <w:r>
-              <w:t>Coopmaster - systém</w:t>
+              <w:t>Coopmaster</w:t>
+            </w:r>
+            <w:proofErr w:type="spellEnd"/>
+            <w:r>
+              <w:t xml:space="preserve"> - systém</w:t>
             </w:r>
             <w:proofErr w:type="gramEnd"/>
             <w:r>
@@ -213,6 +218,14 @@
               <w:jc w:val="both"/>
             </w:pPr>
           </w:p>
+          <w:p>
+            <w:pPr>
+              <w:jc w:val="both"/>
+            </w:pPr>
+            <w:r>
+              <w:t>jarous.nemec@gmail.com</w:t>
+            </w:r>
+          </w:p>
         </w:tc>
       </w:tr>
     </w:tbl>
@@ -227,50 +240,138 @@
         <w:spacing w:line="240" w:lineRule="auto"/>
         <w:ind w:firstLine="708"/>
         <w:jc w:val="both"/>
+        <w:rPr>
+          <w:rFonts w:cstheme="minorHAnsi"/>
+          <w:sz w:val="24"/>
+          <w:szCs w:val="24"/>
+        </w:rPr>
       </w:pPr>
       <w:r>
+        <w:rPr>
+          <w:rFonts w:cstheme="minorHAnsi"/>
+          <w:sz w:val="24"/>
+          <w:szCs w:val="24"/>
+        </w:rPr>
         <w:t xml:space="preserve">Cílem práce </w:t>
       </w:r>
       <w:r>
+        <w:rPr>
+          <w:rFonts w:cstheme="minorHAnsi"/>
+          <w:sz w:val="24"/>
+          <w:szCs w:val="24"/>
+        </w:rPr>
         <w:t>bylo</w:t>
       </w:r>
       <w:r>
-        <w:t xml:space="preserve"> navrhnout a realizovat komplexní asistenční systém (Coopmaster), který automatizuje a zefektivňuje chov kura domácího. Zahrnuje hardwarové prvky (např. automatická dvířka, digitální váhy)</w:t>
-      </w:r>
-      <w:r>
+        <w:rPr>
+          <w:rFonts w:cstheme="minorHAnsi"/>
+          <w:sz w:val="24"/>
+          <w:szCs w:val="24"/>
+        </w:rPr>
+        <w:t xml:space="preserve"> navrhnout a realizovat komplexní asistenční systém (</w:t>
+      </w:r>
+      <w:proofErr w:type="spellStart"/>
+      <w:r>
+        <w:rPr>
+          <w:rFonts w:cstheme="minorHAnsi"/>
+          <w:sz w:val="24"/>
+          <w:szCs w:val="24"/>
+        </w:rPr>
+        <w:t>Coopmaster</w:t>
+      </w:r>
+      <w:proofErr w:type="spellEnd"/>
+      <w:r>
+        <w:rPr>
+          <w:rFonts w:cstheme="minorHAnsi"/>
+          <w:sz w:val="24"/>
+          <w:szCs w:val="24"/>
+        </w:rPr>
+        <w:t>), který automatizuje a zefektivňuje chov kura domácího. Zahrnuje hardwarové prvky (např. automatická dvířka, digitální váhy)</w:t>
+      </w:r>
+      <w:r>
+        <w:rPr>
+          <w:rFonts w:cstheme="minorHAnsi"/>
+          <w:sz w:val="24"/>
+          <w:szCs w:val="24"/>
+        </w:rPr>
         <w:t xml:space="preserve"> i</w:t>
       </w:r>
       <w:r>
+        <w:rPr>
+          <w:rFonts w:cstheme="minorHAnsi"/>
+          <w:sz w:val="24"/>
+          <w:szCs w:val="24"/>
+        </w:rPr>
         <w:t xml:space="preserve"> pokročilý softwarový ekosystém (</w:t>
       </w:r>
       <w:proofErr w:type="spellStart"/>
       <w:r>
+        <w:rPr>
+          <w:rFonts w:cstheme="minorHAnsi"/>
+          <w:sz w:val="24"/>
+          <w:szCs w:val="24"/>
+        </w:rPr>
         <w:t>mikroservisní</w:t>
       </w:r>
       <w:proofErr w:type="spellEnd"/>
       <w:r>
+        <w:rPr>
+          <w:rFonts w:cstheme="minorHAnsi"/>
+          <w:sz w:val="24"/>
+          <w:szCs w:val="24"/>
+        </w:rPr>
         <w:t xml:space="preserve"> architektur</w:t>
       </w:r>
       <w:r>
+        <w:rPr>
+          <w:rFonts w:cstheme="minorHAnsi"/>
+          <w:sz w:val="24"/>
+          <w:szCs w:val="24"/>
+        </w:rPr>
         <w:t>a</w:t>
       </w:r>
       <w:r>
+        <w:rPr>
+          <w:rFonts w:cstheme="minorHAnsi"/>
+          <w:sz w:val="24"/>
+          <w:szCs w:val="24"/>
+        </w:rPr>
         <w:t xml:space="preserve">, zpracování obrazu neuronovými sítěmi, </w:t>
       </w:r>
       <w:proofErr w:type="spellStart"/>
       <w:r>
+        <w:rPr>
+          <w:rFonts w:cstheme="minorHAnsi"/>
+          <w:sz w:val="24"/>
+          <w:szCs w:val="24"/>
+        </w:rPr>
         <w:t>Home</w:t>
       </w:r>
       <w:proofErr w:type="spellEnd"/>
       <w:r>
+        <w:rPr>
+          <w:rFonts w:cstheme="minorHAnsi"/>
+          <w:sz w:val="24"/>
+          <w:szCs w:val="24"/>
+        </w:rPr>
         <w:t xml:space="preserve"> </w:t>
       </w:r>
       <w:proofErr w:type="spellStart"/>
       <w:r>
+        <w:rPr>
+          <w:rFonts w:cstheme="minorHAnsi"/>
+          <w:sz w:val="24"/>
+          <w:szCs w:val="24"/>
+        </w:rPr>
         <w:t>Assistant</w:t>
       </w:r>
       <w:proofErr w:type="spellEnd"/>
       <w:r>
+        <w:rPr>
+          <w:rFonts w:cstheme="minorHAnsi"/>
+          <w:sz w:val="24"/>
+          <w:szCs w:val="24"/>
+        </w:rPr>
         <w:t>), aby chovatel získal vyšší komfort, mohl na dálku dohlížet na celý proces a současně zajistil lepší podmínky pro zvířata.</w:t>
       </w:r>
     </w:p>
@@ -278,22 +379,88 @@
       <w:pPr>
         <w:ind w:firstLine="708"/>
         <w:jc w:val="both"/>
+        <w:rPr>
+          <w:rFonts w:cstheme="minorHAnsi"/>
+          <w:sz w:val="24"/>
+          <w:szCs w:val="24"/>
+        </w:rPr>
       </w:pPr>
       <w:r>
+        <w:rPr>
+          <w:rFonts w:cstheme="minorHAnsi"/>
+          <w:sz w:val="24"/>
+          <w:szCs w:val="24"/>
+        </w:rPr>
         <w:t>Při vývoji systému jsem využil agilní metodiky, které umožnily pružně reagovat na změny a průběžně vylepšovat funkce na základě reálného testování</w:t>
       </w:r>
       <w:r>
+        <w:rPr>
+          <w:rFonts w:cstheme="minorHAnsi"/>
+          <w:sz w:val="24"/>
+          <w:szCs w:val="24"/>
+        </w:rPr>
         <w:t xml:space="preserve"> s důrazem na validaci dat a spolehlivost</w:t>
       </w:r>
       <w:r>
-        <w:t xml:space="preserve">. Klíčovou roli hrálo programování od ovládání hardwaru po integraci s platformou Home Assistant. Využil jsem principy návrhu </w:t>
+        <w:rPr>
+          <w:rFonts w:cstheme="minorHAnsi"/>
+          <w:sz w:val="24"/>
+          <w:szCs w:val="24"/>
+        </w:rPr>
+        <w:t xml:space="preserve">. Klíčovou roli hrálo programování od ovládání hardwaru po integraci s platformou </w:t>
       </w:r>
       <w:proofErr w:type="spellStart"/>
       <w:r>
+        <w:rPr>
+          <w:rFonts w:cstheme="minorHAnsi"/>
+          <w:sz w:val="24"/>
+          <w:szCs w:val="24"/>
+        </w:rPr>
+        <w:t>Home</w:t>
+      </w:r>
+      <w:proofErr w:type="spellEnd"/>
+      <w:r>
+        <w:rPr>
+          <w:rFonts w:cstheme="minorHAnsi"/>
+          <w:sz w:val="24"/>
+          <w:szCs w:val="24"/>
+        </w:rPr>
+        <w:t xml:space="preserve"> </w:t>
+      </w:r>
+      <w:proofErr w:type="spellStart"/>
+      <w:r>
+        <w:rPr>
+          <w:rFonts w:cstheme="minorHAnsi"/>
+          <w:sz w:val="24"/>
+          <w:szCs w:val="24"/>
+        </w:rPr>
+        <w:t>Assistant</w:t>
+      </w:r>
+      <w:proofErr w:type="spellEnd"/>
+      <w:r>
+        <w:rPr>
+          <w:rFonts w:cstheme="minorHAnsi"/>
+          <w:sz w:val="24"/>
+          <w:szCs w:val="24"/>
+        </w:rPr>
+        <w:t xml:space="preserve">. Využil jsem principy návrhu </w:t>
+      </w:r>
+      <w:proofErr w:type="spellStart"/>
+      <w:r>
+        <w:rPr>
+          <w:rFonts w:cstheme="minorHAnsi"/>
+          <w:sz w:val="24"/>
+          <w:szCs w:val="24"/>
+        </w:rPr>
         <w:t>IoT</w:t>
       </w:r>
       <w:proofErr w:type="spellEnd"/>
       <w:r>
+        <w:rPr>
+          <w:rFonts w:cstheme="minorHAnsi"/>
+          <w:sz w:val="24"/>
+          <w:szCs w:val="24"/>
+        </w:rPr>
         <w:t xml:space="preserve"> systémů, včetně senzorové sítě a zpracování vstupních dat, a také základy počítačového vidění pro detekci slepic, vajec a vetřelců. </w:t>
       </w:r>
     </w:p>
@@ -301,74 +468,178 @@
       <w:pPr>
         <w:ind w:firstLine="708"/>
         <w:jc w:val="both"/>
+        <w:rPr>
+          <w:rFonts w:cstheme="minorHAnsi"/>
+          <w:sz w:val="24"/>
+          <w:szCs w:val="24"/>
+        </w:rPr>
       </w:pPr>
       <w:r>
+        <w:rPr>
+          <w:rFonts w:cstheme="minorHAnsi"/>
+          <w:sz w:val="24"/>
+          <w:szCs w:val="24"/>
+        </w:rPr>
         <w:t xml:space="preserve">Vyvinul jsem </w:t>
       </w:r>
       <w:r>
+        <w:rPr>
+          <w:rFonts w:cstheme="minorHAnsi"/>
+          <w:sz w:val="24"/>
+          <w:szCs w:val="24"/>
+        </w:rPr>
         <w:t xml:space="preserve">tedy </w:t>
       </w:r>
       <w:r>
+        <w:rPr>
+          <w:rFonts w:cstheme="minorHAnsi"/>
+          <w:sz w:val="24"/>
+          <w:szCs w:val="24"/>
+        </w:rPr>
         <w:t>systém, který mi pomáhá efektivně řídit chov slepic v reálném čase. Klíčové funkce zahrnují možnost vzdálené kontroly situace v kurníku a ve výběhu, automatické upozornění na nesrovnalosti, jako je například přítomnost vetřelce, a sledování počtu slepic, což mi usnadňuje automatizaci některých procesů, např</w:t>
       </w:r>
       <w:r>
+        <w:rPr>
+          <w:rFonts w:cstheme="minorHAnsi"/>
+          <w:sz w:val="24"/>
+          <w:szCs w:val="24"/>
+        </w:rPr>
         <w:t>.</w:t>
       </w:r>
       <w:r>
+        <w:rPr>
+          <w:rFonts w:cstheme="minorHAnsi"/>
+          <w:sz w:val="24"/>
+          <w:szCs w:val="24"/>
+        </w:rPr>
         <w:t xml:space="preserve"> zavírání dvířek. Systém poskytuje živé záběry z bezpečnostních kamer a monitoruje stavy hnízd, včetně přítomnosti slepic a počtu vajec. Tato data používám k analýze a zlepšování chovu.</w:t>
       </w:r>
       <w:r>
-        <w:t xml:space="preserve"> </w:t>
-      </w:r>
-      <w:r>
-        <w:t>Problémovou se ukázala být detekce obrazu za špatných světelných podmínek, což bude do další verze vylepšeno.</w:t>
+        <w:rPr>
+          <w:rFonts w:cstheme="minorHAnsi"/>
+          <w:sz w:val="24"/>
+          <w:szCs w:val="24"/>
+        </w:rPr>
+        <w:t xml:space="preserve"> Problémovou se ukázala být detekce obrazu za špatných světelných podmínek, což bude do další verze vylepšeno.</w:t>
       </w:r>
     </w:p>
     <w:p>
       <w:pPr>
         <w:ind w:firstLine="708"/>
         <w:jc w:val="both"/>
+        <w:rPr>
+          <w:rFonts w:cstheme="minorHAnsi"/>
+          <w:sz w:val="24"/>
+          <w:szCs w:val="24"/>
+        </w:rPr>
       </w:pPr>
       <w:r>
+        <w:rPr>
+          <w:rFonts w:cstheme="minorHAnsi"/>
+          <w:sz w:val="24"/>
+          <w:szCs w:val="24"/>
+        </w:rPr>
         <w:t>V budoucnu p</w:t>
       </w:r>
       <w:r>
-        <w:t>lánuji systém sdílet v komunitě Home Assistant pro inspiraci další</w:t>
-      </w:r>
-      <w:r>
+        <w:rPr>
+          <w:rFonts w:cstheme="minorHAnsi"/>
+          <w:sz w:val="24"/>
+          <w:szCs w:val="24"/>
+        </w:rPr>
+        <w:t xml:space="preserve">lánuji systém sdílet v komunitě </w:t>
+      </w:r>
+      <w:proofErr w:type="spellStart"/>
+      <w:r>
+        <w:rPr>
+          <w:rFonts w:cstheme="minorHAnsi"/>
+          <w:sz w:val="24"/>
+          <w:szCs w:val="24"/>
+        </w:rPr>
+        <w:t>Home</w:t>
+      </w:r>
+      <w:proofErr w:type="spellEnd"/>
+      <w:r>
+        <w:rPr>
+          <w:rFonts w:cstheme="minorHAnsi"/>
+          <w:sz w:val="24"/>
+          <w:szCs w:val="24"/>
+        </w:rPr>
+        <w:t xml:space="preserve"> </w:t>
+      </w:r>
+      <w:proofErr w:type="spellStart"/>
+      <w:r>
+        <w:rPr>
+          <w:rFonts w:cstheme="minorHAnsi"/>
+          <w:sz w:val="24"/>
+          <w:szCs w:val="24"/>
+        </w:rPr>
+        <w:t>Assistant</w:t>
+      </w:r>
+      <w:proofErr w:type="spellEnd"/>
+      <w:r>
+        <w:rPr>
+          <w:rFonts w:cstheme="minorHAnsi"/>
+          <w:sz w:val="24"/>
+          <w:szCs w:val="24"/>
+        </w:rPr>
+        <w:t xml:space="preserve"> pro inspiraci další</w:t>
+      </w:r>
+      <w:r>
+        <w:rPr>
+          <w:rFonts w:cstheme="minorHAnsi"/>
+          <w:sz w:val="24"/>
+          <w:szCs w:val="24"/>
+        </w:rPr>
         <w:t>ch</w:t>
       </w:r>
       <w:r>
-        <w:t xml:space="preserve"> nadšenců v oblasti </w:t>
-      </w:r>
-      <w:r>
-        <w:t>automatizace</w:t>
-      </w:r>
-      <w:r>
-        <w:t>.</w:t>
-      </w:r>
-      <w:r>
+        <w:rPr>
+          <w:rFonts w:cstheme="minorHAnsi"/>
+          <w:sz w:val="24"/>
+          <w:szCs w:val="24"/>
+        </w:rPr>
+        <w:t xml:space="preserve"> nadšenců v oblasti automatizace.</w:t>
+      </w:r>
+      <w:r>
+        <w:rPr>
+          <w:rFonts w:cstheme="minorHAnsi"/>
+          <w:sz w:val="24"/>
+          <w:szCs w:val="24"/>
+        </w:rPr>
         <w:t xml:space="preserve"> </w:t>
       </w:r>
       <w:r>
-        <w:t xml:space="preserve">Celkově se jedná o významný pokrok </w:t>
-      </w:r>
-      <w:r>
-        <w:t xml:space="preserve">v automatizaci a monitorování </w:t>
-      </w:r>
-      <w:r>
-        <w:t>chovu slepic s potenciálem pro další vylepšení</w:t>
-      </w:r>
-      <w:r>
+        <w:rPr>
+          <w:rFonts w:cstheme="minorHAnsi"/>
+          <w:sz w:val="24"/>
+          <w:szCs w:val="24"/>
+        </w:rPr>
+        <w:t>Celkově se jedná o významný pokrok v automatizaci a monitorování chovu slepic s potenciálem pro další vylepšení</w:t>
+      </w:r>
+      <w:r>
+        <w:rPr>
+          <w:rFonts w:cstheme="minorHAnsi"/>
+          <w:sz w:val="24"/>
+          <w:szCs w:val="24"/>
+        </w:rPr>
         <w:t xml:space="preserve"> a následné nasazení v malých i větších chovech</w:t>
       </w:r>
       <w:r>
+        <w:rPr>
+          <w:rFonts w:cstheme="minorHAnsi"/>
+          <w:sz w:val="24"/>
+          <w:szCs w:val="24"/>
+        </w:rPr>
         <w:t>.</w:t>
       </w:r>
     </w:p>
     <w:p>
       <w:pPr>
         <w:jc w:val="both"/>
+        <w:rPr>
+          <w:rFonts w:ascii="Arial" w:hAnsi="Arial" w:cs="Arial"/>
+        </w:rPr>
       </w:pPr>
     </w:p>
     <w:p>

</xml_diff>